<commit_message>
docs: Actualizar cifras del informe y documentos con los datos de data/
Tablas 1 a 5, estadísticos de correlación, Mincer, ANOVA, Kruskal-Wallis
y brecha de género, derivaciones por programa y consultas por tema,
según el recálculo. Se aclara que Kruskal-Wallis es la prueba de
referencia por el leve desvío de normalidad. Capturas del dashboard con
el mapa corregido. Las conclusiones no cambian.
</commit_message>
<xml_diff>
--- a/docs/informe_final_unves_2026.docx
+++ b/docs/informe_final_unves_2026.docx
@@ -615,7 +615,7 @@
         <w:t xml:space="preserve"> </w:t>
       </w:r>
       <w:r>
-        <w:t xml:space="preserve">micro y pequeñas empresas (MYPEs) en siete barrios urbanos y periurbanos de Villarrica, se constató que el 85.24% de los trabajadores percibe ingresos inferiores al salario mínimo legal vigente (Gs. 3.044.000), con un ingreso medio de Gs. 2.345.060 y un déficit salarial medio de Gs. -698.940 respecto a dicho parámetro. En materia de seguridad social, el 95.24% de los trabajadores carece de cobertura en el Instituto de Previsión Social (IPS); solo el 4.76% (20 personas) cuenta con aseguramiento. La correlación entre años de escolaridad e ingresos resultó nula y no significativa (</w:t>
+        <w:t xml:space="preserve">micro y pequeñas empresas (MYPEs) en siete barrios urbanos y periurbanos de Villarrica, se constató que el 85.24% de los trabajadores percibe ingresos inferiores al salario mínimo legal vigente (Gs. 3.044.000), con un ingreso medio de Gs. 2.338.369 y un déficit salarial medio de Gs. -705.631 respecto a dicho parámetro. En materia de seguridad social, el 95.24% de los trabajadores carece de cobertura en el Instituto de Previsión Social (IPS); solo el 4.76% (20 personas) cuenta con aseguramiento. La correlación entre años de escolaridad e ingresos resultó nula y no significativa (</w:t>
       </w:r>
       <m:oMath>
         <m:r>
@@ -628,7 +628,7 @@
           <m:t>=</m:t>
         </m:r>
         <m:r>
-          <m:t>0.0163</m:t>
+          <m:t>0.0092</m:t>
         </m:r>
       </m:oMath>
       <w:r>
@@ -648,7 +648,7 @@
           <m:t>=</m:t>
         </m:r>
         <m:r>
-          <m:t>.739</m:t>
+          <m:t>.850</m:t>
         </m:r>
       </m:oMath>
       <w:r>
@@ -668,7 +668,13 @@
           <m:t>=</m:t>
         </m:r>
         <m:r>
-          <m:t>0.0091</m:t>
+          <m:rPr>
+            <m:sty m:val="p"/>
+          </m:rPr>
+          <m:t>−</m:t>
+        </m:r>
+        <m:r>
+          <m:t>0.0005</m:t>
         </m:r>
       </m:oMath>
       <w:r>
@@ -688,7 +694,7 @@
           <m:t>=</m:t>
         </m:r>
         <m:r>
-          <m:t>.852</m:t>
+          <m:t>.991</m:t>
         </m:r>
       </m:oMath>
       <w:r>
@@ -727,7 +733,7 @@
           <m:t>=</m:t>
         </m:r>
         <m:r>
-          <m:t>0.2272</m:t>
+          <m:t>0.3435</m:t>
         </m:r>
       </m:oMath>
       <w:r>
@@ -747,7 +753,7 @@
           <m:t>=</m:t>
         </m:r>
         <m:r>
-          <m:t>.9231</m:t>
+          <m:t>.8485</m:t>
         </m:r>
       </m:oMath>
       <w:r>
@@ -791,7 +797,7 @@
           <m:t>−</m:t>
         </m:r>
         <m:r>
-          <m:t>0.0074</m:t>
+          <m:t>0.0063</m:t>
         </m:r>
       </m:oMath>
       <w:r>
@@ -808,7 +814,7 @@
           <m:t>=</m:t>
         </m:r>
         <m:r>
-          <m:t>0.00078</m:t>
+          <m:t>0.00043</m:t>
         </m:r>
       </m:oMath>
       <w:r>
@@ -828,7 +834,7 @@
           <m:t>=</m:t>
         </m:r>
         <m:r>
-          <m:t>.860</m:t>
+          <m:t>.920</m:t>
         </m:r>
       </m:oMath>
       <w:r>
@@ -865,7 +871,7 @@
         <w:t xml:space="preserve"> </w:t>
       </w:r>
       <w:r>
-        <w:t xml:space="preserve">operó durante 42 días continuos (del 01 de setiembre al 12 de octubre de 2026) sobre cuatro canales (Meta Ads, WhatsApp Business, Puntos Presenciales y Afiches con QR). Con una inversión de Gs. 5.504.000, la campaña alcanzó a 193.889 personas, generó 23.869 interacciones y 8.792 consultas (5.337 sobre RESIMPLE y 3.455 sobre IPS), y canalizó 2.217 derivaciones efectivas hacia la ventanilla SUACE (1.344) y la Agencia Regional del IPS (873). Los canales de proximidad (WhatsApp y Puntos Presenciales) resultaron sustancialmente más costo-eficientes (Gs. 151 y Gs. 321 por consulta) que la pauta digital masiva (Gs. 3.106). Los hallazgos aportan evidencia para reorientar las políticas públicas locales hacia un modelo de ventanilla única descentralizada y educación tributaria aplicada.</w:t>
+        <w:t xml:space="preserve">operó durante 42 días continuos (del 01 de setiembre al 12 de octubre de 2026) sobre cuatro canales (Meta Ads, WhatsApp Business, Puntos Presenciales y Afiches con QR). Con una inversión de Gs. 5.504.000, la campaña alcanzó a 193.889 personas, generó 23.869 interacciones y 8.792 consultas (5.332 sobre RESIMPLE y 3.460 sobre IPS), y canalizó 2.217 derivaciones efectivas hacia la ventanilla SUACE (1.340) y la Agencia Regional del IPS (877). Los canales de proximidad (WhatsApp y Puntos Presenciales) resultaron sustancialmente más costo-eficientes (Gs. 151 y Gs. 321 por consulta) que la pauta digital masiva (Gs. 3.106). Los hallazgos aportan evidencia para reorientar las políticas públicas locales hacia un modelo de ventanilla única descentralizada y educación tributaria aplicada.</w:t>
       </w:r>
     </w:p>
     <w:p>
@@ -1511,7 +1517,7 @@
         <w:t xml:space="preserve"> </w:t>
       </w:r>
       <w:r>
-        <w:t xml:space="preserve">trabajadores relevados revela que el ingreso medio mensual se sitúa en Gs. 2.345.060 (</w:t>
+        <w:t xml:space="preserve">trabajadores relevados revela que el ingreso medio mensual se sitúa en Gs. 2.338.369 (</w:t>
       </w:r>
       <m:oMath>
         <m:r>
@@ -1527,11 +1533,11 @@
           <m:t>=</m:t>
         </m:r>
         <m:r>
-          <m:t>725.694</m:t>
+          <m:t>721.870</m:t>
         </m:r>
       </m:oMath>
       <w:r>
-        <w:t xml:space="preserve">), lo que implica una brecha salarial negativa promedio de Gs. -698.940 respecto al piso legal.</w:t>
+        <w:t xml:space="preserve">), lo que implica una brecha salarial negativa promedio de Gs. -705.631 respecto al piso legal.</w:t>
       </w:r>
     </w:p>
     <w:p>
@@ -1539,7 +1545,7 @@
         <w:pStyle w:val="BodyText"/>
       </w:pPr>
       <w:r>
-        <w:t xml:space="preserve">El 85.24% de los trabajadores informales (358 personas) percibe ingresos inferiores al salario mínimo legal; el 50% central se concentra entre Gs. 1.838.750 y Gs. 2.900.000 (</w:t>
+        <w:t xml:space="preserve">El 85.24% de los trabajadores informales (358 personas) percibe ingresos inferiores al salario mínimo legal; el 50% central se concentra entre Gs. 1.778.750 y Gs. 2.721.250 (</w:t>
       </w:r>
       <m:oMath>
         <m:r>
@@ -1558,14 +1564,11 @@
           <m:t>=</m:t>
         </m:r>
         <m:r>
-          <m:t>1.061</m:t>
-        </m:r>
-        <m:r>
-          <m:t>.250</m:t>
+          <m:t>942.500</m:t>
         </m:r>
       </m:oMath>
       <w:r>
-        <w:t xml:space="preserve">), con una mediana de Gs. 2.332.500. En cuanto a la cobertura previsional, el 95.24% carece de seguro médico o jubilación en el IPS; la cobertura se limita al 4.76% (20 trabajadores), que aportan bajo la modalidad de cotización voluntaria independiente o figuran como beneficiarios familiares.</w:t>
+        <w:t xml:space="preserve">), con una mediana de Gs. 2.255.000. En cuanto a la cobertura previsional, el 95.24% carece de seguro médico o jubilación en el IPS; la cobertura se limita al 4.76% (20 trabajadores), que aportan bajo la modalidad de cotización voluntaria independiente o figuran como beneficiarios familiares.</w:t>
       </w:r>
     </w:p>
     <w:p>
@@ -1745,52 +1748,52 @@
               <w:rPr>
                 <w:sz w:val="20"/>
               </w:rPr>
-              <w:t xml:space="preserve">2.345.060</w:t>
-            </w:r>
-          </w:p>
-        </w:tc>
-        <w:tc>
-          <w:tcPr/>
-          <w:p>
-            <w:pPr>
-              <w:pStyle w:val="Compact"/>
-              <w:jc w:val="center"/>
-            </w:pPr>
-            <w:r>
-              <w:rPr>
-                <w:sz w:val="20"/>
-              </w:rPr>
-              <w:t xml:space="preserve">725.694</w:t>
-            </w:r>
-          </w:p>
-        </w:tc>
-        <w:tc>
-          <w:tcPr/>
-          <w:p>
-            <w:pPr>
-              <w:pStyle w:val="Compact"/>
-              <w:jc w:val="center"/>
-            </w:pPr>
-            <w:r>
-              <w:rPr>
-                <w:sz w:val="20"/>
-              </w:rPr>
-              <w:t xml:space="preserve">2.332.500</w:t>
-            </w:r>
-          </w:p>
-        </w:tc>
-        <w:tc>
-          <w:tcPr/>
-          <w:p>
-            <w:pPr>
-              <w:pStyle w:val="Compact"/>
-              <w:jc w:val="center"/>
-            </w:pPr>
-            <w:r>
-              <w:rPr>
-                <w:sz w:val="20"/>
-              </w:rPr>
-              <w:t xml:space="preserve">1.061.250</w:t>
+              <w:t xml:space="preserve">2.338.369</w:t>
+            </w:r>
+          </w:p>
+        </w:tc>
+        <w:tc>
+          <w:tcPr/>
+          <w:p>
+            <w:pPr>
+              <w:pStyle w:val="Compact"/>
+              <w:jc w:val="center"/>
+            </w:pPr>
+            <w:r>
+              <w:rPr>
+                <w:sz w:val="20"/>
+              </w:rPr>
+              <w:t xml:space="preserve">721.870</w:t>
+            </w:r>
+          </w:p>
+        </w:tc>
+        <w:tc>
+          <w:tcPr/>
+          <w:p>
+            <w:pPr>
+              <w:pStyle w:val="Compact"/>
+              <w:jc w:val="center"/>
+            </w:pPr>
+            <w:r>
+              <w:rPr>
+                <w:sz w:val="20"/>
+              </w:rPr>
+              <w:t xml:space="preserve">2.255.000</w:t>
+            </w:r>
+          </w:p>
+        </w:tc>
+        <w:tc>
+          <w:tcPr/>
+          <w:p>
+            <w:pPr>
+              <w:pStyle w:val="Compact"/>
+              <w:jc w:val="center"/>
+            </w:pPr>
+            <w:r>
+              <w:rPr>
+                <w:sz w:val="20"/>
+              </w:rPr>
+              <w:t xml:space="preserve">942.500</w:t>
             </w:r>
           </w:p>
         </w:tc>
@@ -1820,7 +1823,7 @@
               <w:rPr>
                 <w:sz w:val="20"/>
               </w:rPr>
-              <w:t xml:space="preserve">4.160.000</w:t>
+              <w:t xml:space="preserve">4.180.000</w:t>
             </w:r>
           </w:p>
         </w:tc>
@@ -1852,52 +1855,52 @@
               <w:rPr>
                 <w:sz w:val="20"/>
               </w:rPr>
-              <w:t xml:space="preserve">-698.940</w:t>
-            </w:r>
-          </w:p>
-        </w:tc>
-        <w:tc>
-          <w:tcPr/>
-          <w:p>
-            <w:pPr>
-              <w:pStyle w:val="Compact"/>
-              <w:jc w:val="center"/>
-            </w:pPr>
-            <w:r>
-              <w:rPr>
-                <w:sz w:val="20"/>
-              </w:rPr>
-              <w:t xml:space="preserve">725.694</w:t>
-            </w:r>
-          </w:p>
-        </w:tc>
-        <w:tc>
-          <w:tcPr/>
-          <w:p>
-            <w:pPr>
-              <w:pStyle w:val="Compact"/>
-              <w:jc w:val="center"/>
-            </w:pPr>
-            <w:r>
-              <w:rPr>
-                <w:sz w:val="20"/>
-              </w:rPr>
-              <w:t xml:space="preserve">-711.500</w:t>
-            </w:r>
-          </w:p>
-        </w:tc>
-        <w:tc>
-          <w:tcPr/>
-          <w:p>
-            <w:pPr>
-              <w:pStyle w:val="Compact"/>
-              <w:jc w:val="center"/>
-            </w:pPr>
-            <w:r>
-              <w:rPr>
-                <w:sz w:val="20"/>
-              </w:rPr>
-              <w:t xml:space="preserve">1.061.250</w:t>
+              <w:t xml:space="preserve">-705.631</w:t>
+            </w:r>
+          </w:p>
+        </w:tc>
+        <w:tc>
+          <w:tcPr/>
+          <w:p>
+            <w:pPr>
+              <w:pStyle w:val="Compact"/>
+              <w:jc w:val="center"/>
+            </w:pPr>
+            <w:r>
+              <w:rPr>
+                <w:sz w:val="20"/>
+              </w:rPr>
+              <w:t xml:space="preserve">721.870</w:t>
+            </w:r>
+          </w:p>
+        </w:tc>
+        <w:tc>
+          <w:tcPr/>
+          <w:p>
+            <w:pPr>
+              <w:pStyle w:val="Compact"/>
+              <w:jc w:val="center"/>
+            </w:pPr>
+            <w:r>
+              <w:rPr>
+                <w:sz w:val="20"/>
+              </w:rPr>
+              <w:t xml:space="preserve">-789.000</w:t>
+            </w:r>
+          </w:p>
+        </w:tc>
+        <w:tc>
+          <w:tcPr/>
+          <w:p>
+            <w:pPr>
+              <w:pStyle w:val="Compact"/>
+              <w:jc w:val="center"/>
+            </w:pPr>
+            <w:r>
+              <w:rPr>
+                <w:sz w:val="20"/>
+              </w:rPr>
+              <w:t xml:space="preserve">942.500</w:t>
             </w:r>
           </w:p>
         </w:tc>
@@ -1927,7 +1930,7 @@
               <w:rPr>
                 <w:sz w:val="20"/>
               </w:rPr>
-              <w:t xml:space="preserve">1.116.000</w:t>
+              <w:t xml:space="preserve">1.136.000</w:t>
             </w:r>
           </w:p>
         </w:tc>
@@ -1959,22 +1962,22 @@
               <w:rPr>
                 <w:sz w:val="20"/>
               </w:rPr>
-              <w:t xml:space="preserve">8,96</w:t>
-            </w:r>
-          </w:p>
-        </w:tc>
-        <w:tc>
-          <w:tcPr/>
-          <w:p>
-            <w:pPr>
-              <w:pStyle w:val="Compact"/>
-              <w:jc w:val="center"/>
-            </w:pPr>
-            <w:r>
-              <w:rPr>
-                <w:sz w:val="20"/>
-              </w:rPr>
-              <w:t xml:space="preserve">3,49</w:t>
+              <w:t xml:space="preserve">9,05</w:t>
+            </w:r>
+          </w:p>
+        </w:tc>
+        <w:tc>
+          <w:tcPr/>
+          <w:p>
+            <w:pPr>
+              <w:pStyle w:val="Compact"/>
+              <w:jc w:val="center"/>
+            </w:pPr>
+            <w:r>
+              <w:rPr>
+                <w:sz w:val="20"/>
+              </w:rPr>
+              <w:t xml:space="preserve">3,50</w:t>
             </w:r>
           </w:p>
         </w:tc>
@@ -2066,52 +2069,52 @@
               <w:rPr>
                 <w:sz w:val="20"/>
               </w:rPr>
-              <w:t xml:space="preserve">42,58</w:t>
-            </w:r>
-          </w:p>
-        </w:tc>
-        <w:tc>
-          <w:tcPr/>
-          <w:p>
-            <w:pPr>
-              <w:pStyle w:val="Compact"/>
-              <w:jc w:val="center"/>
-            </w:pPr>
-            <w:r>
-              <w:rPr>
-                <w:sz w:val="20"/>
-              </w:rPr>
-              <w:t xml:space="preserve">14,38</w:t>
-            </w:r>
-          </w:p>
-        </w:tc>
-        <w:tc>
-          <w:tcPr/>
-          <w:p>
-            <w:pPr>
-              <w:pStyle w:val="Compact"/>
-              <w:jc w:val="center"/>
-            </w:pPr>
-            <w:r>
-              <w:rPr>
-                <w:sz w:val="20"/>
-              </w:rPr>
-              <w:t xml:space="preserve">43,00</w:t>
-            </w:r>
-          </w:p>
-        </w:tc>
-        <w:tc>
-          <w:tcPr/>
-          <w:p>
-            <w:pPr>
-              <w:pStyle w:val="Compact"/>
-              <w:jc w:val="center"/>
-            </w:pPr>
-            <w:r>
-              <w:rPr>
-                <w:sz w:val="20"/>
-              </w:rPr>
-              <w:t xml:space="preserve">25,00</w:t>
+              <w:t xml:space="preserve">43,15</w:t>
+            </w:r>
+          </w:p>
+        </w:tc>
+        <w:tc>
+          <w:tcPr/>
+          <w:p>
+            <w:pPr>
+              <w:pStyle w:val="Compact"/>
+              <w:jc w:val="center"/>
+            </w:pPr>
+            <w:r>
+              <w:rPr>
+                <w:sz w:val="20"/>
+              </w:rPr>
+              <w:t xml:space="preserve">14,26</w:t>
+            </w:r>
+          </w:p>
+        </w:tc>
+        <w:tc>
+          <w:tcPr/>
+          <w:p>
+            <w:pPr>
+              <w:pStyle w:val="Compact"/>
+              <w:jc w:val="center"/>
+            </w:pPr>
+            <w:r>
+              <w:rPr>
+                <w:sz w:val="20"/>
+              </w:rPr>
+              <w:t xml:space="preserve">44,00</w:t>
+            </w:r>
+          </w:p>
+        </w:tc>
+        <w:tc>
+          <w:tcPr/>
+          <w:p>
+            <w:pPr>
+              <w:pStyle w:val="Compact"/>
+              <w:jc w:val="center"/>
+            </w:pPr>
+            <w:r>
+              <w:rPr>
+                <w:sz w:val="20"/>
+              </w:rPr>
+              <w:t xml:space="preserve">24,00</w:t>
             </w:r>
           </w:p>
         </w:tc>
@@ -2173,52 +2176,52 @@
               <w:rPr>
                 <w:sz w:val="20"/>
               </w:rPr>
-              <w:t xml:space="preserve">45,72</w:t>
-            </w:r>
-          </w:p>
-        </w:tc>
-        <w:tc>
-          <w:tcPr/>
-          <w:p>
-            <w:pPr>
-              <w:pStyle w:val="Compact"/>
-              <w:jc w:val="center"/>
-            </w:pPr>
-            <w:r>
-              <w:rPr>
-                <w:sz w:val="20"/>
-              </w:rPr>
-              <w:t xml:space="preserve">12,82</w:t>
-            </w:r>
-          </w:p>
-        </w:tc>
-        <w:tc>
-          <w:tcPr/>
-          <w:p>
-            <w:pPr>
-              <w:pStyle w:val="Compact"/>
-              <w:jc w:val="center"/>
-            </w:pPr>
-            <w:r>
-              <w:rPr>
-                <w:sz w:val="20"/>
-              </w:rPr>
-              <w:t xml:space="preserve">45,00</w:t>
-            </w:r>
-          </w:p>
-        </w:tc>
-        <w:tc>
-          <w:tcPr/>
-          <w:p>
-            <w:pPr>
-              <w:pStyle w:val="Compact"/>
-              <w:jc w:val="center"/>
-            </w:pPr>
-            <w:r>
-              <w:rPr>
-                <w:sz w:val="20"/>
-              </w:rPr>
-              <w:t xml:space="preserve">23,25</w:t>
+              <w:t xml:space="preserve">46,63</w:t>
+            </w:r>
+          </w:p>
+        </w:tc>
+        <w:tc>
+          <w:tcPr/>
+          <w:p>
+            <w:pPr>
+              <w:pStyle w:val="Compact"/>
+              <w:jc w:val="center"/>
+            </w:pPr>
+            <w:r>
+              <w:rPr>
+                <w:sz w:val="20"/>
+              </w:rPr>
+              <w:t xml:space="preserve">12,63</w:t>
+            </w:r>
+          </w:p>
+        </w:tc>
+        <w:tc>
+          <w:tcPr/>
+          <w:p>
+            <w:pPr>
+              <w:pStyle w:val="Compact"/>
+              <w:jc w:val="center"/>
+            </w:pPr>
+            <w:r>
+              <w:rPr>
+                <w:sz w:val="20"/>
+              </w:rPr>
+              <w:t xml:space="preserve">46,00</w:t>
+            </w:r>
+          </w:p>
+        </w:tc>
+        <w:tc>
+          <w:tcPr/>
+          <w:p>
+            <w:pPr>
+              <w:pStyle w:val="Compact"/>
+              <w:jc w:val="center"/>
+            </w:pPr>
+            <w:r>
+              <w:rPr>
+                <w:sz w:val="20"/>
+              </w:rPr>
+              <w:t xml:space="preserve">22,00</w:t>
             </w:r>
           </w:p>
         </w:tc>
@@ -2295,22 +2298,22 @@
               <w:rPr>
                 <w:sz w:val="20"/>
               </w:rPr>
-              <w:t xml:space="preserve">14,88</w:t>
-            </w:r>
-          </w:p>
-        </w:tc>
-        <w:tc>
-          <w:tcPr/>
-          <w:p>
-            <w:pPr>
-              <w:pStyle w:val="Compact"/>
-              <w:jc w:val="center"/>
-            </w:pPr>
-            <w:r>
-              <w:rPr>
-                <w:sz w:val="20"/>
-              </w:rPr>
-              <w:t xml:space="preserve">52,50</w:t>
+              <w:t xml:space="preserve">15,00</w:t>
+            </w:r>
+          </w:p>
+        </w:tc>
+        <w:tc>
+          <w:tcPr/>
+          <w:p>
+            <w:pPr>
+              <w:pStyle w:val="Compact"/>
+              <w:jc w:val="center"/>
+            </w:pPr>
+            <w:r>
+              <w:rPr>
+                <w:sz w:val="20"/>
+              </w:rPr>
+              <w:t xml:space="preserve">52,00</w:t>
             </w:r>
           </w:p>
         </w:tc>
@@ -2340,22 +2343,22 @@
               <w:rPr>
                 <w:sz w:val="20"/>
               </w:rPr>
-              <w:t xml:space="preserve">10,00</w:t>
-            </w:r>
-          </w:p>
-        </w:tc>
-        <w:tc>
-          <w:tcPr/>
-          <w:p>
-            <w:pPr>
-              <w:pStyle w:val="Compact"/>
-              <w:jc w:val="center"/>
-            </w:pPr>
-            <w:r>
-              <w:rPr>
-                <w:sz w:val="20"/>
-              </w:rPr>
-              <w:t xml:space="preserve">96,00</w:t>
+              <w:t xml:space="preserve">14,00</w:t>
+            </w:r>
+          </w:p>
+        </w:tc>
+        <w:tc>
+          <w:tcPr/>
+          <w:p>
+            <w:pPr>
+              <w:pStyle w:val="Compact"/>
+              <w:jc w:val="center"/>
+            </w:pPr>
+            <w:r>
+              <w:rPr>
+                <w:sz w:val="20"/>
+              </w:rPr>
+              <w:t xml:space="preserve">94,00</w:t>
             </w:r>
           </w:p>
         </w:tc>
@@ -2444,7 +2447,7 @@
           <m:t>=</m:t>
         </m:r>
         <m:r>
-          <m:t>0.0163</m:t>
+          <m:t>0.0092</m:t>
         </m:r>
       </m:oMath>
       <w:r>
@@ -2477,7 +2480,7 @@
           <m:t>=</m:t>
         </m:r>
         <m:r>
-          <m:t>0.334</m:t>
+          <m:t>0.189</m:t>
         </m:r>
       </m:oMath>
       <w:r>
@@ -2497,7 +2500,7 @@
           <m:t>=</m:t>
         </m:r>
         <m:r>
-          <m:t>.739</m:t>
+          <m:t>.850</m:t>
         </m:r>
       </m:oMath>
       <w:r>
@@ -2522,7 +2525,7 @@
               <m:t>−</m:t>
             </m:r>
             <m:r>
-              <m:t>0.0795</m:t>
+              <m:t>0.0865</m:t>
             </m:r>
             <m:r>
               <m:rPr>
@@ -2531,7 +2534,7 @@
               <m:t>,</m:t>
             </m:r>
             <m:r>
-              <m:t>0.1118</m:t>
+              <m:t>0.1048</m:t>
             </m:r>
           </m:e>
         </m:d>
@@ -2550,7 +2553,13 @@
           <m:t>=</m:t>
         </m:r>
         <m:r>
-          <m:t>0.0091</m:t>
+          <m:rPr>
+            <m:sty m:val="p"/>
+          </m:rPr>
+          <m:t>−</m:t>
+        </m:r>
+        <m:r>
+          <m:t>0.0005</m:t>
         </m:r>
       </m:oMath>
       <w:r>
@@ -2570,7 +2579,7 @@
           <m:t>=</m:t>
         </m:r>
         <m:r>
-          <m:t>.852</m:t>
+          <m:t>.991</m:t>
         </m:r>
       </m:oMath>
       <w:r>
@@ -3039,37 +3048,37 @@
               <w:rPr>
                 <w:sz w:val="20"/>
               </w:rPr>
-              <w:t xml:space="preserve">14,6584</w:t>
-            </w:r>
-          </w:p>
-        </w:tc>
-        <w:tc>
-          <w:tcPr/>
-          <w:p>
-            <w:pPr>
-              <w:pStyle w:val="Compact"/>
-              <w:jc w:val="center"/>
-            </w:pPr>
-            <w:r>
-              <w:rPr>
-                <w:sz w:val="20"/>
-              </w:rPr>
-              <w:t xml:space="preserve">0,0687</w:t>
-            </w:r>
-          </w:p>
-        </w:tc>
-        <w:tc>
-          <w:tcPr/>
-          <w:p>
-            <w:pPr>
-              <w:pStyle w:val="Compact"/>
-              <w:jc w:val="center"/>
-            </w:pPr>
-            <w:r>
-              <w:rPr>
-                <w:sz w:val="20"/>
-              </w:rPr>
-              <w:t xml:space="preserve">213,381</w:t>
+              <w:t xml:space="preserve">14,6145</w:t>
+            </w:r>
+          </w:p>
+        </w:tc>
+        <w:tc>
+          <w:tcPr/>
+          <w:p>
+            <w:pPr>
+              <w:pStyle w:val="Compact"/>
+              <w:jc w:val="center"/>
+            </w:pPr>
+            <w:r>
+              <w:rPr>
+                <w:sz w:val="20"/>
+              </w:rPr>
+              <w:t xml:space="preserve">0,0675</w:t>
+            </w:r>
+          </w:p>
+        </w:tc>
+        <w:tc>
+          <w:tcPr/>
+          <w:p>
+            <w:pPr>
+              <w:pStyle w:val="Compact"/>
+              <w:jc w:val="center"/>
+            </w:pPr>
+            <w:r>
+              <w:rPr>
+                <w:sz w:val="20"/>
+              </w:rPr>
+              <w:t xml:space="preserve">216,425</w:t>
             </w:r>
           </w:p>
         </w:tc>
@@ -3141,52 +3150,52 @@
               <w:rPr>
                 <w:sz w:val="20"/>
               </w:rPr>
-              <w:t xml:space="preserve">0,0008</w:t>
-            </w:r>
-          </w:p>
-        </w:tc>
-        <w:tc>
-          <w:tcPr/>
-          <w:p>
-            <w:pPr>
-              <w:pStyle w:val="Compact"/>
-              <w:jc w:val="center"/>
-            </w:pPr>
-            <w:r>
-              <w:rPr>
-                <w:sz w:val="20"/>
-              </w:rPr>
-              <w:t xml:space="preserve">0,0044</w:t>
-            </w:r>
-          </w:p>
-        </w:tc>
-        <w:tc>
-          <w:tcPr/>
-          <w:p>
-            <w:pPr>
-              <w:pStyle w:val="Compact"/>
-              <w:jc w:val="center"/>
-            </w:pPr>
-            <w:r>
-              <w:rPr>
-                <w:sz w:val="20"/>
-              </w:rPr>
-              <w:t xml:space="preserve">0,177</w:t>
-            </w:r>
-          </w:p>
-        </w:tc>
-        <w:tc>
-          <w:tcPr/>
-          <w:p>
-            <w:pPr>
-              <w:pStyle w:val="Compact"/>
-              <w:jc w:val="center"/>
-            </w:pPr>
-            <w:r>
-              <w:rPr>
-                <w:sz w:val="20"/>
-              </w:rPr>
-              <w:t xml:space="preserve">,860</w:t>
+              <w:t xml:space="preserve">0,0004</w:t>
+            </w:r>
+          </w:p>
+        </w:tc>
+        <w:tc>
+          <w:tcPr/>
+          <w:p>
+            <w:pPr>
+              <w:pStyle w:val="Compact"/>
+              <w:jc w:val="center"/>
+            </w:pPr>
+            <w:r>
+              <w:rPr>
+                <w:sz w:val="20"/>
+              </w:rPr>
+              <w:t xml:space="preserve">0,0043</w:t>
+            </w:r>
+          </w:p>
+        </w:tc>
+        <w:tc>
+          <w:tcPr/>
+          <w:p>
+            <w:pPr>
+              <w:pStyle w:val="Compact"/>
+              <w:jc w:val="center"/>
+            </w:pPr>
+            <w:r>
+              <w:rPr>
+                <w:sz w:val="20"/>
+              </w:rPr>
+              <w:t xml:space="preserve">0,100</w:t>
+            </w:r>
+          </w:p>
+        </w:tc>
+        <w:tc>
+          <w:tcPr/>
+          <w:p>
+            <w:pPr>
+              <w:pStyle w:val="Compact"/>
+              <w:jc w:val="center"/>
+            </w:pPr>
+            <w:r>
+              <w:rPr>
+                <w:sz w:val="20"/>
+              </w:rPr>
+              <w:t xml:space="preserve">,920</w:t>
             </w:r>
           </w:p>
         </w:tc>
@@ -3238,7 +3247,7 @@
               <w:rPr>
                 <w:sz w:val="20"/>
               </w:rPr>
-              <w:t xml:space="preserve">-0,0007</w:t>
+              <w:t xml:space="preserve">0,0016</w:t>
             </w:r>
           </w:p>
         </w:tc>
@@ -3268,22 +3277,22 @@
               <w:rPr>
                 <w:sz w:val="20"/>
               </w:rPr>
-              <w:t xml:space="preserve">-0,333</w:t>
-            </w:r>
-          </w:p>
-        </w:tc>
-        <w:tc>
-          <w:tcPr/>
-          <w:p>
-            <w:pPr>
-              <w:pStyle w:val="Compact"/>
-              <w:jc w:val="center"/>
-            </w:pPr>
-            <w:r>
-              <w:rPr>
-                <w:sz w:val="20"/>
-              </w:rPr>
-              <w:t xml:space="preserve">,740</w:t>
+              <w:t xml:space="preserve">0,767</w:t>
+            </w:r>
+          </w:p>
+        </w:tc>
+        <w:tc>
+          <w:tcPr/>
+          <w:p>
+            <w:pPr>
+              <w:pStyle w:val="Compact"/>
+              <w:jc w:val="center"/>
+            </w:pPr>
+            <w:r>
+              <w:rPr>
+                <w:sz w:val="20"/>
+              </w:rPr>
+              <w:t xml:space="preserve">,443</w:t>
             </w:r>
           </w:p>
         </w:tc>
@@ -3335,52 +3344,52 @@
               <w:rPr>
                 <w:sz w:val="20"/>
               </w:rPr>
-              <w:t xml:space="preserve">-0,0006</w:t>
-            </w:r>
-          </w:p>
-        </w:tc>
-        <w:tc>
-          <w:tcPr/>
-          <w:p>
-            <w:pPr>
-              <w:pStyle w:val="Compact"/>
-              <w:jc w:val="center"/>
-            </w:pPr>
-            <w:r>
-              <w:rPr>
-                <w:sz w:val="20"/>
-              </w:rPr>
-              <w:t xml:space="preserve">0,0013</w:t>
-            </w:r>
-          </w:p>
-        </w:tc>
-        <w:tc>
-          <w:tcPr/>
-          <w:p>
-            <w:pPr>
-              <w:pStyle w:val="Compact"/>
-              <w:jc w:val="center"/>
-            </w:pPr>
-            <w:r>
-              <w:rPr>
-                <w:sz w:val="20"/>
-              </w:rPr>
-              <w:t xml:space="preserve">-0,441</w:t>
-            </w:r>
-          </w:p>
-        </w:tc>
-        <w:tc>
-          <w:tcPr/>
-          <w:p>
-            <w:pPr>
-              <w:pStyle w:val="Compact"/>
-              <w:jc w:val="center"/>
-            </w:pPr>
-            <w:r>
-              <w:rPr>
-                <w:sz w:val="20"/>
-              </w:rPr>
-              <w:t xml:space="preserve">,660</w:t>
+              <w:t xml:space="preserve">0,0000</w:t>
+            </w:r>
+          </w:p>
+        </w:tc>
+        <w:tc>
+          <w:tcPr/>
+          <w:p>
+            <w:pPr>
+              <w:pStyle w:val="Compact"/>
+              <w:jc w:val="center"/>
+            </w:pPr>
+            <w:r>
+              <w:rPr>
+                <w:sz w:val="20"/>
+              </w:rPr>
+              <w:t xml:space="preserve">0,0012</w:t>
+            </w:r>
+          </w:p>
+        </w:tc>
+        <w:tc>
+          <w:tcPr/>
+          <w:p>
+            <w:pPr>
+              <w:pStyle w:val="Compact"/>
+              <w:jc w:val="center"/>
+            </w:pPr>
+            <w:r>
+              <w:rPr>
+                <w:sz w:val="20"/>
+              </w:rPr>
+              <w:t xml:space="preserve">0,006</w:t>
+            </w:r>
+          </w:p>
+        </w:tc>
+        <w:tc>
+          <w:tcPr/>
+          <w:p>
+            <w:pPr>
+              <w:pStyle w:val="Compact"/>
+              <w:jc w:val="center"/>
+            </w:pPr>
+            <w:r>
+              <w:rPr>
+                <w:sz w:val="20"/>
+              </w:rPr>
+              <w:t xml:space="preserve">,995</w:t>
             </w:r>
           </w:p>
         </w:tc>
@@ -3432,52 +3441,52 @@
               <w:rPr>
                 <w:sz w:val="20"/>
               </w:rPr>
-              <w:t xml:space="preserve">-0,0178</w:t>
-            </w:r>
-          </w:p>
-        </w:tc>
-        <w:tc>
-          <w:tcPr/>
-          <w:p>
-            <w:pPr>
-              <w:pStyle w:val="Compact"/>
-              <w:jc w:val="center"/>
-            </w:pPr>
-            <w:r>
-              <w:rPr>
-                <w:sz w:val="20"/>
-              </w:rPr>
-              <w:t xml:space="preserve">0,0358</w:t>
-            </w:r>
-          </w:p>
-        </w:tc>
-        <w:tc>
-          <w:tcPr/>
-          <w:p>
-            <w:pPr>
-              <w:pStyle w:val="Compact"/>
-              <w:jc w:val="center"/>
-            </w:pPr>
-            <w:r>
-              <w:rPr>
-                <w:sz w:val="20"/>
-              </w:rPr>
-              <w:t xml:space="preserve">-0,498</w:t>
-            </w:r>
-          </w:p>
-        </w:tc>
-        <w:tc>
-          <w:tcPr/>
-          <w:p>
-            <w:pPr>
-              <w:pStyle w:val="Compact"/>
-              <w:jc w:val="center"/>
-            </w:pPr>
-            <w:r>
-              <w:rPr>
-                <w:sz w:val="20"/>
-              </w:rPr>
-              <w:t xml:space="preserve">,619</w:t>
+              <w:t xml:space="preserve">-0,0244</w:t>
+            </w:r>
+          </w:p>
+        </w:tc>
+        <w:tc>
+          <w:tcPr/>
+          <w:p>
+            <w:pPr>
+              <w:pStyle w:val="Compact"/>
+              <w:jc w:val="center"/>
+            </w:pPr>
+            <w:r>
+              <w:rPr>
+                <w:sz w:val="20"/>
+              </w:rPr>
+              <w:t xml:space="preserve">0,0345</w:t>
+            </w:r>
+          </w:p>
+        </w:tc>
+        <w:tc>
+          <w:tcPr/>
+          <w:p>
+            <w:pPr>
+              <w:pStyle w:val="Compact"/>
+              <w:jc w:val="center"/>
+            </w:pPr>
+            <w:r>
+              <w:rPr>
+                <w:sz w:val="20"/>
+              </w:rPr>
+              <w:t xml:space="preserve">-0,708</w:t>
+            </w:r>
+          </w:p>
+        </w:tc>
+        <w:tc>
+          <w:tcPr/>
+          <w:p>
+            <w:pPr>
+              <w:pStyle w:val="Compact"/>
+              <w:jc w:val="center"/>
+            </w:pPr>
+            <w:r>
+              <w:rPr>
+                <w:sz w:val="20"/>
+              </w:rPr>
+              <w:t xml:space="preserve">,479</w:t>
             </w:r>
           </w:p>
         </w:tc>
@@ -3557,7 +3566,7 @@
           <m:t>=</m:t>
         </m:r>
         <m:r>
-          <m:t>0.0022</m:t>
+          <m:t>0.0033</m:t>
         </m:r>
       </m:oMath>
       <w:r>
@@ -3601,7 +3610,7 @@
           <m:t>−</m:t>
         </m:r>
         <m:r>
-          <m:t>0.0074</m:t>
+          <m:t>0.0063</m:t>
         </m:r>
       </m:oMath>
       <w:r>
@@ -3643,7 +3652,7 @@
           <m:t>=</m:t>
         </m:r>
         <m:r>
-          <m:t>0.2272</m:t>
+          <m:t>0.3435</m:t>
         </m:r>
       </m:oMath>
       <w:r>
@@ -3663,7 +3672,7 @@
           <m:t>=</m:t>
         </m:r>
         <m:r>
-          <m:t>.9231</m:t>
+          <m:t>.8485</m:t>
         </m:r>
       </m:oMath>
       <w:r>
@@ -3688,7 +3697,7 @@
           <m:t>=</m:t>
         </m:r>
         <m:r>
-          <m:t>.9231</m:t>
+          <m:t>.8485</m:t>
         </m:r>
       </m:oMath>
       <w:r>
@@ -3714,7 +3723,7 @@
           <m:t>=</m:t>
         </m:r>
         <m:r>
-          <m:t>0.00078</m:t>
+          <m:t>0.00043</m:t>
         </m:r>
       </m:oMath>
       <w:r>
@@ -3734,7 +3743,7 @@
           <m:t>=</m:t>
         </m:r>
         <m:r>
-          <m:t>.860</m:t>
+          <m:t>.920</m:t>
         </m:r>
       </m:oMath>
       <w:r>
@@ -4040,7 +4049,7 @@
               <w:rPr>
                 <w:sz w:val="18"/>
               </w:rPr>
-              <w:t xml:space="preserve">Centro</w:t>
+              <w:t xml:space="preserve">Ybaroty</w:t>
             </w:r>
           </w:p>
         </w:tc>
@@ -4055,7 +4064,7 @@
               <w:rPr>
                 <w:sz w:val="18"/>
               </w:rPr>
-              <w:t xml:space="preserve">90</w:t>
+              <w:t xml:space="preserve">68</w:t>
             </w:r>
           </w:p>
         </w:tc>
@@ -4070,7 +4079,7 @@
               <w:rPr>
                 <w:sz w:val="18"/>
               </w:rPr>
-              <w:t xml:space="preserve">54,96</w:t>
+              <w:t xml:space="preserve">53,88</w:t>
             </w:r>
           </w:p>
         </w:tc>
@@ -4085,7 +4094,7 @@
               <w:rPr>
                 <w:sz w:val="18"/>
               </w:rPr>
-              <w:t xml:space="preserve">13,68</w:t>
+              <w:t xml:space="preserve">15,26</w:t>
             </w:r>
           </w:p>
         </w:tc>
@@ -4100,7 +4109,7 @@
               <w:rPr>
                 <w:sz w:val="18"/>
               </w:rPr>
-              <w:t xml:space="preserve">57,00</w:t>
+              <w:t xml:space="preserve">56,50</w:t>
             </w:r>
           </w:p>
         </w:tc>
@@ -4115,7 +4124,7 @@
               <w:rPr>
                 <w:sz w:val="18"/>
               </w:rPr>
-              <w:t xml:space="preserve">18,00</w:t>
+              <w:t xml:space="preserve">19,25</w:t>
             </w:r>
           </w:p>
         </w:tc>
@@ -4130,7 +4139,7 @@
               <w:rPr>
                 <w:sz w:val="18"/>
               </w:rPr>
-              <w:t xml:space="preserve">2.232.833</w:t>
+              <w:t xml:space="preserve">2.226.029</w:t>
             </w:r>
           </w:p>
         </w:tc>
@@ -4145,7 +4154,7 @@
               <w:rPr>
                 <w:sz w:val="18"/>
               </w:rPr>
-              <w:t xml:space="preserve">91,11%</w:t>
+              <w:t xml:space="preserve">86,76%</w:t>
             </w:r>
           </w:p>
         </w:tc>
@@ -4162,7 +4171,7 @@
               <w:rPr>
                 <w:sz w:val="18"/>
               </w:rPr>
-              <w:t xml:space="preserve">San Miguel</w:t>
+              <w:t xml:space="preserve">Lomas Valentinas</w:t>
             </w:r>
           </w:p>
         </w:tc>
@@ -4177,7 +4186,7 @@
               <w:rPr>
                 <w:sz w:val="18"/>
               </w:rPr>
-              <w:t xml:space="preserve">63</w:t>
+              <w:t xml:space="preserve">32</w:t>
             </w:r>
           </w:p>
         </w:tc>
@@ -4192,7 +4201,7 @@
               <w:rPr>
                 <w:sz w:val="18"/>
               </w:rPr>
-              <w:t xml:space="preserve">52,68</w:t>
+              <w:t xml:space="preserve">53,75</w:t>
             </w:r>
           </w:p>
         </w:tc>
@@ -4207,7 +4216,7 @@
               <w:rPr>
                 <w:sz w:val="18"/>
               </w:rPr>
-              <w:t xml:space="preserve">13,58</w:t>
+              <w:t xml:space="preserve">15,09</w:t>
             </w:r>
           </w:p>
         </w:tc>
@@ -4237,7 +4246,7 @@
               <w:rPr>
                 <w:sz w:val="18"/>
               </w:rPr>
-              <w:t xml:space="preserve">15,50</w:t>
+              <w:t xml:space="preserve">24,75</w:t>
             </w:r>
           </w:p>
         </w:tc>
@@ -4252,7 +4261,7 @@
               <w:rPr>
                 <w:sz w:val="18"/>
               </w:rPr>
-              <w:t xml:space="preserve">2.359.365</w:t>
+              <w:t xml:space="preserve">2.331.719</w:t>
             </w:r>
           </w:p>
         </w:tc>
@@ -4267,7 +4276,7 @@
               <w:rPr>
                 <w:sz w:val="18"/>
               </w:rPr>
-              <w:t xml:space="preserve">87,30%</w:t>
+              <w:t xml:space="preserve">87,50%</w:t>
             </w:r>
           </w:p>
         </w:tc>
@@ -4284,7 +4293,7 @@
               <w:rPr>
                 <w:sz w:val="18"/>
               </w:rPr>
-              <w:t xml:space="preserve">Estación</w:t>
+              <w:t xml:space="preserve">Tuyutimí</w:t>
             </w:r>
           </w:p>
         </w:tc>
@@ -4299,7 +4308,7 @@
               <w:rPr>
                 <w:sz w:val="18"/>
               </w:rPr>
-              <w:t xml:space="preserve">51</w:t>
+              <w:t xml:space="preserve">39</w:t>
             </w:r>
           </w:p>
         </w:tc>
@@ -4314,7 +4323,7 @@
               <w:rPr>
                 <w:sz w:val="18"/>
               </w:rPr>
-              <w:t xml:space="preserve">52,65</w:t>
+              <w:t xml:space="preserve">52,79</w:t>
             </w:r>
           </w:p>
         </w:tc>
@@ -4329,7 +4338,7 @@
               <w:rPr>
                 <w:sz w:val="18"/>
               </w:rPr>
-              <w:t xml:space="preserve">16,04</w:t>
+              <w:t xml:space="preserve">15,67</w:t>
             </w:r>
           </w:p>
         </w:tc>
@@ -4344,7 +4353,7 @@
               <w:rPr>
                 <w:sz w:val="18"/>
               </w:rPr>
-              <w:t xml:space="preserve">52,00</w:t>
+              <w:t xml:space="preserve">54,00</w:t>
             </w:r>
           </w:p>
         </w:tc>
@@ -4359,7 +4368,7 @@
               <w:rPr>
                 <w:sz w:val="18"/>
               </w:rPr>
-              <w:t xml:space="preserve">20,50</w:t>
+              <w:t xml:space="preserve">19,50</w:t>
             </w:r>
           </w:p>
         </w:tc>
@@ -4374,7 +4383,7 @@
               <w:rPr>
                 <w:sz w:val="18"/>
               </w:rPr>
-              <w:t xml:space="preserve">2.256.078</w:t>
+              <w:t xml:space="preserve">2.349.615</w:t>
             </w:r>
           </w:p>
         </w:tc>
@@ -4389,7 +4398,7 @@
               <w:rPr>
                 <w:sz w:val="18"/>
               </w:rPr>
-              <w:t xml:space="preserve">82,35%</w:t>
+              <w:t xml:space="preserve">87,18%</w:t>
             </w:r>
           </w:p>
         </w:tc>
@@ -4406,7 +4415,7 @@
               <w:rPr>
                 <w:sz w:val="18"/>
               </w:rPr>
-              <w:t xml:space="preserve">Ybaroty</w:t>
+              <w:t xml:space="preserve">Estación</w:t>
             </w:r>
           </w:p>
         </w:tc>
@@ -4421,7 +4430,7 @@
               <w:rPr>
                 <w:sz w:val="18"/>
               </w:rPr>
-              <w:t xml:space="preserve">68</w:t>
+              <w:t xml:space="preserve">51</w:t>
             </w:r>
           </w:p>
         </w:tc>
@@ -4436,7 +4445,7 @@
               <w:rPr>
                 <w:sz w:val="18"/>
               </w:rPr>
-              <w:t xml:space="preserve">51,40</w:t>
+              <w:t xml:space="preserve">52,75</w:t>
             </w:r>
           </w:p>
         </w:tc>
@@ -4451,7 +4460,7 @@
               <w:rPr>
                 <w:sz w:val="18"/>
               </w:rPr>
-              <w:t xml:space="preserve">17,34</w:t>
+              <w:t xml:space="preserve">14,70</w:t>
             </w:r>
           </w:p>
         </w:tc>
@@ -4466,7 +4475,7 @@
               <w:rPr>
                 <w:sz w:val="18"/>
               </w:rPr>
-              <w:t xml:space="preserve">53,00</w:t>
+              <w:t xml:space="preserve">52,00</w:t>
             </w:r>
           </w:p>
         </w:tc>
@@ -4481,7 +4490,7 @@
               <w:rPr>
                 <w:sz w:val="18"/>
               </w:rPr>
-              <w:t xml:space="preserve">26,75</w:t>
+              <w:t xml:space="preserve">19,50</w:t>
             </w:r>
           </w:p>
         </w:tc>
@@ -4496,7 +4505,7 @@
               <w:rPr>
                 <w:sz w:val="18"/>
               </w:rPr>
-              <w:t xml:space="preserve">2.448.824</w:t>
+              <w:t xml:space="preserve">2.198.824</w:t>
             </w:r>
           </w:p>
         </w:tc>
@@ -4511,7 +4520,7 @@
               <w:rPr>
                 <w:sz w:val="18"/>
               </w:rPr>
-              <w:t xml:space="preserve">76,47%</w:t>
+              <w:t xml:space="preserve">88,24%</w:t>
             </w:r>
           </w:p>
         </w:tc>
@@ -4528,7 +4537,7 @@
               <w:rPr>
                 <w:sz w:val="18"/>
               </w:rPr>
-              <w:t xml:space="preserve">Lomas Valentinas</w:t>
+              <w:t xml:space="preserve">Centro</w:t>
             </w:r>
           </w:p>
         </w:tc>
@@ -4543,7 +4552,7 @@
               <w:rPr>
                 <w:sz w:val="18"/>
               </w:rPr>
-              <w:t xml:space="preserve">32</w:t>
+              <w:t xml:space="preserve">90</w:t>
             </w:r>
           </w:p>
         </w:tc>
@@ -4558,7 +4567,7 @@
               <w:rPr>
                 <w:sz w:val="18"/>
               </w:rPr>
-              <w:t xml:space="preserve">50,00</w:t>
+              <w:t xml:space="preserve">51,22</w:t>
             </w:r>
           </w:p>
         </w:tc>
@@ -4573,7 +4582,7 @@
               <w:rPr>
                 <w:sz w:val="18"/>
               </w:rPr>
-              <w:t xml:space="preserve">12,55</w:t>
+              <w:t xml:space="preserve">15,38</w:t>
             </w:r>
           </w:p>
         </w:tc>
@@ -4588,7 +4597,7 @@
               <w:rPr>
                 <w:sz w:val="18"/>
               </w:rPr>
-              <w:t xml:space="preserve">47,50</w:t>
+              <w:t xml:space="preserve">52,50</w:t>
             </w:r>
           </w:p>
         </w:tc>
@@ -4603,7 +4612,7 @@
               <w:rPr>
                 <w:sz w:val="18"/>
               </w:rPr>
-              <w:t xml:space="preserve">17,50</w:t>
+              <w:t xml:space="preserve">22,00</w:t>
             </w:r>
           </w:p>
         </w:tc>
@@ -4618,7 +4627,7 @@
               <w:rPr>
                 <w:sz w:val="18"/>
               </w:rPr>
-              <w:t xml:space="preserve">2.316.563</w:t>
+              <w:t xml:space="preserve">2.382.111</w:t>
             </w:r>
           </w:p>
         </w:tc>
@@ -4633,7 +4642,7 @@
               <w:rPr>
                 <w:sz w:val="18"/>
               </w:rPr>
-              <w:t xml:space="preserve">87,50%</w:t>
+              <w:t xml:space="preserve">82,22%</w:t>
             </w:r>
           </w:p>
         </w:tc>
@@ -4650,7 +4659,7 @@
               <w:rPr>
                 <w:sz w:val="18"/>
               </w:rPr>
-              <w:t xml:space="preserve">Tuyutimí</w:t>
+              <w:t xml:space="preserve">San Miguel</w:t>
             </w:r>
           </w:p>
         </w:tc>
@@ -4665,7 +4674,7 @@
               <w:rPr>
                 <w:sz w:val="18"/>
               </w:rPr>
-              <w:t xml:space="preserve">39</w:t>
+              <w:t xml:space="preserve">63</w:t>
             </w:r>
           </w:p>
         </w:tc>
@@ -4680,7 +4689,7 @@
               <w:rPr>
                 <w:sz w:val="18"/>
               </w:rPr>
-              <w:t xml:space="preserve">49,23</w:t>
+              <w:t xml:space="preserve">50,16</w:t>
             </w:r>
           </w:p>
         </w:tc>
@@ -4695,7 +4704,7 @@
               <w:rPr>
                 <w:sz w:val="18"/>
               </w:rPr>
-              <w:t xml:space="preserve">15,44</w:t>
+              <w:t xml:space="preserve">14,54</w:t>
             </w:r>
           </w:p>
         </w:tc>
@@ -4710,7 +4719,7 @@
               <w:rPr>
                 <w:sz w:val="18"/>
               </w:rPr>
-              <w:t xml:space="preserve">48,00</w:t>
+              <w:t xml:space="preserve">51,00</w:t>
             </w:r>
           </w:p>
         </w:tc>
@@ -4725,7 +4734,7 @@
               <w:rPr>
                 <w:sz w:val="18"/>
               </w:rPr>
-              <w:t xml:space="preserve">23,50</w:t>
+              <w:t xml:space="preserve">19,00</w:t>
             </w:r>
           </w:p>
         </w:tc>
@@ -4740,7 +4749,7 @@
               <w:rPr>
                 <w:sz w:val="18"/>
               </w:rPr>
-              <w:t xml:space="preserve">2.520.000</w:t>
+              <w:t xml:space="preserve">2.404.286</w:t>
             </w:r>
           </w:p>
         </w:tc>
@@ -4755,7 +4764,7 @@
               <w:rPr>
                 <w:sz w:val="18"/>
               </w:rPr>
-              <w:t xml:space="preserve">82,05%</w:t>
+              <w:t xml:space="preserve">84,13%</w:t>
             </w:r>
           </w:p>
         </w:tc>
@@ -4802,7 +4811,7 @@
               <w:rPr>
                 <w:sz w:val="18"/>
               </w:rPr>
-              <w:t xml:space="preserve">49,10</w:t>
+              <w:t xml:space="preserve">49,92</w:t>
             </w:r>
           </w:p>
         </w:tc>
@@ -4817,7 +4826,7 @@
               <w:rPr>
                 <w:sz w:val="18"/>
               </w:rPr>
-              <w:t xml:space="preserve">14,42</w:t>
+              <w:t xml:space="preserve">14,66</w:t>
             </w:r>
           </w:p>
         </w:tc>
@@ -4832,7 +4841,7 @@
               <w:rPr>
                 <w:sz w:val="18"/>
               </w:rPr>
-              <w:t xml:space="preserve">52,00</w:t>
+              <w:t xml:space="preserve">51,00</w:t>
             </w:r>
           </w:p>
         </w:tc>
@@ -4847,7 +4856,7 @@
               <w:rPr>
                 <w:sz w:val="18"/>
               </w:rPr>
-              <w:t xml:space="preserve">22,00</w:t>
+              <w:t xml:space="preserve">17,00</w:t>
             </w:r>
           </w:p>
         </w:tc>
@@ -4862,7 +4871,7 @@
               <w:rPr>
                 <w:sz w:val="18"/>
               </w:rPr>
-              <w:t xml:space="preserve">2.355.065</w:t>
+              <w:t xml:space="preserve">2.422.013</w:t>
             </w:r>
           </w:p>
         </w:tc>
@@ -4877,7 +4886,7 @@
               <w:rPr>
                 <w:sz w:val="18"/>
               </w:rPr>
-              <w:t xml:space="preserve">87,01%</w:t>
+              <w:t xml:space="preserve">84,42%</w:t>
             </w:r>
           </w:p>
         </w:tc>
@@ -4914,7 +4923,7 @@
           <m:t>=</m:t>
         </m:r>
         <m:r>
-          <m:t>0.9942</m:t>
+          <m:t>0.9930</m:t>
         </m:r>
       </m:oMath>
       <w:r>
@@ -4934,7 +4943,7 @@
           <m:t>=</m:t>
         </m:r>
         <m:r>
-          <m:t>.1084</m:t>
+          <m:t>.0481</m:t>
         </m:r>
       </m:oMath>
       <w:r>
@@ -4963,7 +4972,7 @@
           <m:t>=</m:t>
         </m:r>
         <m:r>
-          <m:t>8.0323</m:t>
+          <m:t>0.5359</m:t>
         </m:r>
       </m:oMath>
       <w:r>
@@ -4983,7 +4992,7 @@
           <m:t>=</m:t>
         </m:r>
         <m:r>
-          <m:t>.2357</m:t>
+          <m:t>.9974</m:t>
         </m:r>
       </m:oMath>
       <w:r>
@@ -5025,7 +5034,7 @@
           <m:t>=</m:t>
         </m:r>
         <m:r>
-          <m:t>1.449</m:t>
+          <m:t>0.717</m:t>
         </m:r>
       </m:oMath>
       <w:r>
@@ -5045,7 +5054,7 @@
           <m:t>=</m:t>
         </m:r>
         <m:r>
-          <m:t>.1944</m:t>
+          <m:t>.6359</m:t>
         </m:r>
       </m:oMath>
       <w:r>
@@ -5078,7 +5087,7 @@
           <m:t>=</m:t>
         </m:r>
         <m:r>
-          <m:t>8.6318</m:t>
+          <m:t>4.9253</m:t>
         </m:r>
       </m:oMath>
       <w:r>
@@ -5098,7 +5107,7 @@
           <m:t>=</m:t>
         </m:r>
         <m:r>
-          <m:t>.1954</m:t>
+          <m:t>.5534</m:t>
         </m:r>
       </m:oMath>
       <w:r>
@@ -5110,7 +5119,24 @@
         <w:pStyle w:val="BodyText"/>
       </w:pPr>
       <w:r>
-        <w:t xml:space="preserve">Dado que los contrastes resultaron no significativos (</w:t>
+        <w:t xml:space="preserve">Como la prueba de Shapiro-Wilk indica un leve desvío de la normalidad (</w:t>
+      </w:r>
+      <m:oMath>
+        <m:r>
+          <m:t>p</m:t>
+        </m:r>
+        <m:r>
+          <m:rPr>
+            <m:sty m:val="p"/>
+          </m:rPr>
+          <m:t>=</m:t>
+        </m:r>
+        <m:r>
+          <m:t>.048</m:t>
+        </m:r>
+      </m:oMath>
+      <w:r>
+        <w:t xml:space="preserve">), se toma como referencia la prueba no paramétrica de Kruskal-Wallis, que coincide con el ANOVA. Dado que ambos contrastes resultaron no significativos (</w:t>
       </w:r>
       <m:oMath>
         <m:r>
@@ -5234,7 +5260,7 @@
         <w:pStyle w:val="FirstParagraph"/>
       </w:pPr>
       <w:r>
-        <w:t xml:space="preserve">Las trabajadoras informales perciben un ingreso medio de Gs. 2.373.107 (</w:t>
+        <w:t xml:space="preserve">Las trabajadoras informales perciben un ingreso medio de Gs. 2.396.729 (</w:t>
       </w:r>
       <m:oMath>
         <m:r>
@@ -5250,7 +5276,7 @@
           <m:t>=</m:t>
         </m:r>
         <m:r>
-          <m:t>732.251</m:t>
+          <m:t>776.595</m:t>
         </m:r>
       </m:oMath>
       <w:r>
@@ -5270,11 +5296,11 @@
           <m:t>=</m:t>
         </m:r>
         <m:r>
-          <m:t>103</m:t>
+          <m:t>107</m:t>
         </m:r>
       </m:oMath>
       <w:r>
-        <w:t xml:space="preserve">), frente a Gs. 2.335.946 (</w:t>
+        <w:t xml:space="preserve">), frente a Gs. 2.318.419 (</w:t>
       </w:r>
       <m:oMath>
         <m:r>
@@ -5290,7 +5316,7 @@
           <m:t>=</m:t>
         </m:r>
         <m:r>
-          <m:t>724.481</m:t>
+          <m:t>702.381</m:t>
         </m:r>
       </m:oMath>
       <w:r>
@@ -5310,11 +5336,11 @@
           <m:t>=</m:t>
         </m:r>
         <m:r>
-          <m:t>317</m:t>
+          <m:t>313</m:t>
         </m:r>
       </m:oMath>
       <w:r>
-        <w:t xml:space="preserve">) de los varones. La diferencia muestral (Gs. 37.160 a favor de las mujeres, 1.59%) no es estadísticamente significativa.</w:t>
+        <w:t xml:space="preserve">) de los varones. La diferencia muestral (Gs. 78.310 a favor de las mujeres, 3.38%) no es estadísticamente significativa.</w:t>
       </w:r>
     </w:p>
     <w:p>
@@ -5507,82 +5533,82 @@
               <w:rPr>
                 <w:sz w:val="20"/>
               </w:rPr>
-              <w:t xml:space="preserve">103</w:t>
-            </w:r>
-          </w:p>
-        </w:tc>
-        <w:tc>
-          <w:tcPr/>
-          <w:p>
-            <w:pPr>
-              <w:pStyle w:val="Compact"/>
-              <w:jc w:val="center"/>
-            </w:pPr>
-            <w:r>
-              <w:rPr>
-                <w:sz w:val="20"/>
-              </w:rPr>
-              <w:t xml:space="preserve">2.373.107</w:t>
-            </w:r>
-          </w:p>
-        </w:tc>
-        <w:tc>
-          <w:tcPr/>
-          <w:p>
-            <w:pPr>
-              <w:pStyle w:val="Compact"/>
-              <w:jc w:val="center"/>
-            </w:pPr>
-            <w:r>
-              <w:rPr>
-                <w:sz w:val="20"/>
-              </w:rPr>
-              <w:t xml:space="preserve">732.251</w:t>
-            </w:r>
-          </w:p>
-        </w:tc>
-        <w:tc>
-          <w:tcPr/>
-          <w:p>
-            <w:pPr>
-              <w:pStyle w:val="Compact"/>
-              <w:jc w:val="center"/>
-            </w:pPr>
-            <w:r>
-              <w:rPr>
-                <w:sz w:val="20"/>
-              </w:rPr>
-              <w:t xml:space="preserve">2.340.000</w:t>
-            </w:r>
-          </w:p>
-        </w:tc>
-        <w:tc>
-          <w:tcPr/>
-          <w:p>
-            <w:pPr>
-              <w:pStyle w:val="Compact"/>
-              <w:jc w:val="center"/>
-            </w:pPr>
-            <w:r>
-              <w:rPr>
-                <w:sz w:val="20"/>
-              </w:rPr>
-              <w:t xml:space="preserve">+37.160</w:t>
-            </w:r>
-          </w:p>
-        </w:tc>
-        <w:tc>
-          <w:tcPr/>
-          <w:p>
-            <w:pPr>
-              <w:pStyle w:val="Compact"/>
-              <w:jc w:val="center"/>
-            </w:pPr>
-            <w:r>
-              <w:rPr>
-                <w:sz w:val="20"/>
-              </w:rPr>
-              <w:t xml:space="preserve">+1,59%</w:t>
+              <w:t xml:space="preserve">107</w:t>
+            </w:r>
+          </w:p>
+        </w:tc>
+        <w:tc>
+          <w:tcPr/>
+          <w:p>
+            <w:pPr>
+              <w:pStyle w:val="Compact"/>
+              <w:jc w:val="center"/>
+            </w:pPr>
+            <w:r>
+              <w:rPr>
+                <w:sz w:val="20"/>
+              </w:rPr>
+              <w:t xml:space="preserve">2.396.729</w:t>
+            </w:r>
+          </w:p>
+        </w:tc>
+        <w:tc>
+          <w:tcPr/>
+          <w:p>
+            <w:pPr>
+              <w:pStyle w:val="Compact"/>
+              <w:jc w:val="center"/>
+            </w:pPr>
+            <w:r>
+              <w:rPr>
+                <w:sz w:val="20"/>
+              </w:rPr>
+              <w:t xml:space="preserve">776.595</w:t>
+            </w:r>
+          </w:p>
+        </w:tc>
+        <w:tc>
+          <w:tcPr/>
+          <w:p>
+            <w:pPr>
+              <w:pStyle w:val="Compact"/>
+              <w:jc w:val="center"/>
+            </w:pPr>
+            <w:r>
+              <w:rPr>
+                <w:sz w:val="20"/>
+              </w:rPr>
+              <w:t xml:space="preserve">2.300.000</w:t>
+            </w:r>
+          </w:p>
+        </w:tc>
+        <w:tc>
+          <w:tcPr/>
+          <w:p>
+            <w:pPr>
+              <w:pStyle w:val="Compact"/>
+              <w:jc w:val="center"/>
+            </w:pPr>
+            <w:r>
+              <w:rPr>
+                <w:sz w:val="20"/>
+              </w:rPr>
+              <w:t xml:space="preserve">+78.310</w:t>
+            </w:r>
+          </w:p>
+        </w:tc>
+        <w:tc>
+          <w:tcPr/>
+          <w:p>
+            <w:pPr>
+              <w:pStyle w:val="Compact"/>
+              <w:jc w:val="center"/>
+            </w:pPr>
+            <w:r>
+              <w:rPr>
+                <w:sz w:val="20"/>
+              </w:rPr>
+              <w:t xml:space="preserve">+3,38%</w:t>
             </w:r>
           </w:p>
         </w:tc>
@@ -5614,52 +5640,52 @@
               <w:rPr>
                 <w:sz w:val="20"/>
               </w:rPr>
-              <w:t xml:space="preserve">317</w:t>
-            </w:r>
-          </w:p>
-        </w:tc>
-        <w:tc>
-          <w:tcPr/>
-          <w:p>
-            <w:pPr>
-              <w:pStyle w:val="Compact"/>
-              <w:jc w:val="center"/>
-            </w:pPr>
-            <w:r>
-              <w:rPr>
-                <w:sz w:val="20"/>
-              </w:rPr>
-              <w:t xml:space="preserve">2.335.946</w:t>
-            </w:r>
-          </w:p>
-        </w:tc>
-        <w:tc>
-          <w:tcPr/>
-          <w:p>
-            <w:pPr>
-              <w:pStyle w:val="Compact"/>
-              <w:jc w:val="center"/>
-            </w:pPr>
-            <w:r>
-              <w:rPr>
-                <w:sz w:val="20"/>
-              </w:rPr>
-              <w:t xml:space="preserve">724.481</w:t>
-            </w:r>
-          </w:p>
-        </w:tc>
-        <w:tc>
-          <w:tcPr/>
-          <w:p>
-            <w:pPr>
-              <w:pStyle w:val="Compact"/>
-              <w:jc w:val="center"/>
-            </w:pPr>
-            <w:r>
-              <w:rPr>
-                <w:sz w:val="20"/>
-              </w:rPr>
-              <w:t xml:space="preserve">2.330.000</w:t>
+              <w:t xml:space="preserve">313</w:t>
+            </w:r>
+          </w:p>
+        </w:tc>
+        <w:tc>
+          <w:tcPr/>
+          <w:p>
+            <w:pPr>
+              <w:pStyle w:val="Compact"/>
+              <w:jc w:val="center"/>
+            </w:pPr>
+            <w:r>
+              <w:rPr>
+                <w:sz w:val="20"/>
+              </w:rPr>
+              <w:t xml:space="preserve">2.318.419</w:t>
+            </w:r>
+          </w:p>
+        </w:tc>
+        <w:tc>
+          <w:tcPr/>
+          <w:p>
+            <w:pPr>
+              <w:pStyle w:val="Compact"/>
+              <w:jc w:val="center"/>
+            </w:pPr>
+            <w:r>
+              <w:rPr>
+                <w:sz w:val="20"/>
+              </w:rPr>
+              <w:t xml:space="preserve">702.381</w:t>
+            </w:r>
+          </w:p>
+        </w:tc>
+        <w:tc>
+          <w:tcPr/>
+          <w:p>
+            <w:pPr>
+              <w:pStyle w:val="Compact"/>
+              <w:jc w:val="center"/>
+            </w:pPr>
+            <w:r>
+              <w:rPr>
+                <w:sz w:val="20"/>
+              </w:rPr>
+              <w:t xml:space="preserve">2.240.000</w:t>
             </w:r>
           </w:p>
         </w:tc>
@@ -5742,7 +5768,7 @@
           </m:dPr>
           <m:e>
             <m:r>
-              <m:t>171.60</m:t>
+              <m:t>169.08</m:t>
             </m:r>
           </m:e>
         </m:d>
@@ -5753,7 +5779,7 @@
           <m:t>=</m:t>
         </m:r>
         <m:r>
-          <m:t>0.4486</m:t>
+          <m:t>0.9221</m:t>
         </m:r>
       </m:oMath>
       <w:r>
@@ -5773,7 +5799,7 @@
           <m:t>=</m:t>
         </m:r>
         <m:r>
-          <m:t>.6543</m:t>
+          <m:t>.3578</m:t>
         </m:r>
       </m:oMath>
       <w:r>
@@ -5793,16 +5819,7 @@
           <m:t>=</m:t>
         </m:r>
         <m:r>
-          <m:t>16.906</m:t>
-        </m:r>
-        <m:r>
-          <m:rPr>
-            <m:sty m:val="p"/>
-          </m:rPr>
-          <m:t>,</m:t>
-        </m:r>
-        <m:r>
-          <m:t>5</m:t>
+          <m:t>17.651</m:t>
         </m:r>
       </m:oMath>
       <w:r>
@@ -5822,7 +5839,7 @@
           <m:t>=</m:t>
         </m:r>
         <m:r>
-          <m:t>.5875</m:t>
+          <m:t>.4038</m:t>
         </m:r>
       </m:oMath>
       <w:r>
@@ -8013,7 +8030,7 @@
               <w:rPr>
                 <w:sz w:val="18"/>
               </w:rPr>
-              <w:t xml:space="preserve">4,97%</w:t>
+              <w:t xml:space="preserve">4,96%</w:t>
             </w:r>
           </w:p>
         </w:tc>
@@ -8401,7 +8418,7 @@
         <w:t xml:space="preserve"> </w:t>
       </w:r>
       <w:r>
-        <w:t xml:space="preserve">Moneda: guaraníes (PYG). Tipología de canales: WhatsApp (mensajería digital), Puntos Presenciales (BTL), Meta Ads (digital pago), Afiches QR (OOH / impreso). CTR = tasa de interacción (interacciones / alcance). De las 8.792 consultas, 5.337 trataron sobre RESIMPLE y 3.455 sobre IPS. Las 2.217 derivaciones se dirigieron a la ventanilla SUACE (1.344) y a la Agencia Regional del IPS (873).</w:t>
+        <w:t xml:space="preserve">Moneda: guaraníes (PYG). Tipología de canales: WhatsApp (mensajería digital), Puntos Presenciales (BTL), Meta Ads (digital pago), Afiches QR (OOH / impreso). CTR = tasa de interacción (interacciones / alcance). De las 8.792 consultas, 5.332 trataron sobre RESIMPLE y 3.460 sobre IPS. Las 2.217 derivaciones se dirigieron a la ventanilla SUACE (1.340) y a la Agencia Regional del IPS (877).</w:t>
       </w:r>
     </w:p>
     <w:p>
@@ -8648,7 +8665,7 @@
           <m:t>=</m:t>
         </m:r>
         <m:r>
-          <m:t>0.0163</m:t>
+          <m:t>0.0092</m:t>
         </m:r>
       </m:oMath>
       <w:r>
@@ -8668,7 +8685,7 @@
           <m:t>=</m:t>
         </m:r>
         <m:r>
-          <m:t>.739</m:t>
+          <m:t>.850</m:t>
         </m:r>
       </m:oMath>
       <w:r>
@@ -8698,7 +8715,7 @@
       </w:r>
       <m:oMath>
         <m:r>
-          <m:t>F</m:t>
+          <m:t>H</m:t>
         </m:r>
         <m:d>
           <m:dPr>
@@ -8711,15 +8728,6 @@
             <m:r>
               <m:t>6</m:t>
             </m:r>
-            <m:r>
-              <m:rPr>
-                <m:sty m:val="p"/>
-              </m:rPr>
-              <m:t>,</m:t>
-            </m:r>
-            <m:r>
-              <m:t>413</m:t>
-            </m:r>
           </m:e>
         </m:d>
         <m:r>
@@ -8729,7 +8737,7 @@
           <m:t>=</m:t>
         </m:r>
         <m:r>
-          <m:t>1.449</m:t>
+          <m:t>4.93</m:t>
         </m:r>
       </m:oMath>
       <w:r>
@@ -8749,7 +8757,7 @@
           <m:t>=</m:t>
         </m:r>
         <m:r>
-          <m:t>.194</m:t>
+          <m:t>.553</m:t>
         </m:r>
       </m:oMath>
       <w:r>

</xml_diff>

<commit_message>
docs: Ubicar el QR del repositorio junto al del dashboard en el Anexo A
Los dos códigos QR (dashboard y repositorio) quedan lado a lado en el
Anexo A y el flyer se mantiene en su propio anexo (Anexo B). Se elimina
el Anexo C, cuyo contenido pasa al Anexo A.

Co-Authored-By: Claude Opus 5.5 <noreply@anthropic.com>
</commit_message>
<xml_diff>
--- a/docs/informe_final_unves_2026.docx
+++ b/docs/informe_final_unves_2026.docx
@@ -13671,65 +13671,183 @@
         <w:t xml:space="preserve">Acceso en línea. </w:t>
       </w:r>
       <w:r>
-        <w:t>El dashboard gerencial está publicado en GitHub Pages y puede abrirse escaneando el siguiente código QR:</w:t>
-      </w:r>
-    </w:p>
-    <w:p>
-      <w:pPr>
-        <w:keepNext/>
+        <w:t xml:space="preserve">El dashboard gerencial está publicado en GitHub Pages y el repositorio público contiene el código fuente y los datos para replicar el estudio (los pasos están en </w:t>
+      </w:r>
+      <w:r>
+        <w:rPr>
+          <w:rStyle w:val="VerbatimChar"/>
+          <w:sz w:val="20"/>
+        </w:rPr>
+        <w:t xml:space="preserve">README.md</w:t>
+      </w:r>
+      <w:r>
+        <w:t xml:space="preserve">). Ambos pueden abrirse escaneando los siguientes códigos QR:</w:t>
+      </w:r>
+    </w:p>
+    <w:tbl>
+      <w:tblPr>
+        <w:tblW w:w="9026" w:type="dxa"/>
         <w:jc w:val="center"/>
-      </w:pPr>
-      <w:r>
-        <w:rPr>
-          <w:noProof/>
-        </w:rPr>
-        <w:drawing>
-          <wp:inline distT="0" distB="0" distL="0" distR="0" wp14:anchorId="17337D2E" wp14:editId="2D560F20">
-            <wp:extent cx="1260000" cy="1260000"/>
-            <wp:effectExtent l="0" t="0" r="0" b="0"/>
-            <wp:docPr id="1744882279" name="Picture 1744882279"/>
-            <wp:cNvGraphicFramePr>
-              <a:graphicFrameLocks xmlns:a="http://schemas.openxmlformats.org/drawingml/2006/main" noChangeAspect="1"/>
-            </wp:cNvGraphicFramePr>
-            <a:graphic xmlns:a="http://schemas.openxmlformats.org/drawingml/2006/main">
-              <a:graphicData uri="http://schemas.openxmlformats.org/drawingml/2006/picture">
-                <pic:pic xmlns:pic="http://schemas.openxmlformats.org/drawingml/2006/picture">
-                  <pic:nvPicPr>
-                    <pic:cNvPr id="0" name="qr_github_pages.png"/>
-                    <pic:cNvPicPr/>
-                  </pic:nvPicPr>
-                  <pic:blipFill>
-                    <a:blip r:embed="rId22"/>
-                    <a:stretch>
-                      <a:fillRect/>
-                    </a:stretch>
-                  </pic:blipFill>
-                  <pic:spPr>
-                    <a:xfrm>
-                      <a:off x="0" y="0"/>
-                      <a:ext cx="1260000" cy="1260000"/>
-                    </a:xfrm>
-                    <a:prstGeom prst="rect">
-                      <a:avLst/>
-                    </a:prstGeom>
-                  </pic:spPr>
-                </pic:pic>
-              </a:graphicData>
-            </a:graphic>
-          </wp:inline>
-        </w:drawing>
-      </w:r>
-    </w:p>
-    <w:p>
-      <w:pPr>
-        <w:jc w:val="center"/>
-      </w:pPr>
-      <w:hyperlink r:id="rId23">
-        <w:r>
-          <w:t>https://gilgapy.github.io/sig-informalidad-villarrica/</w:t>
-        </w:r>
-      </w:hyperlink>
-    </w:p>
+        <w:tblBorders>
+          <w:top w:val="nil"/>
+          <w:left w:val="nil"/>
+          <w:bottom w:val="nil"/>
+          <w:right w:val="nil"/>
+          <w:insideH w:val="nil"/>
+          <w:insideV w:val="nil"/>
+        </w:tblBorders>
+        <w:tblLayout w:type="fixed"/>
+      </w:tblPr>
+      <w:tblGrid>
+        <w:gridCol w:w="4513"/>
+        <w:gridCol w:w="4513"/>
+      </w:tblGrid>
+      <w:tr>
+        <w:trPr>
+          <w:cantSplit/>
+        </w:trPr>
+        <w:tc>
+          <w:tcPr>
+            <w:tcW w:w="4513" w:type="dxa"/>
+          </w:tcPr>
+          <w:p>
+            <w:pPr>
+              <w:keepNext/>
+              <w:jc w:val="center"/>
+            </w:pPr>
+            <w:r>
+              <w:rPr>
+                <w:b/>
+              </w:rPr>
+              <w:t xml:space="preserve">Dashboard gerencial</w:t>
+            </w:r>
+          </w:p>
+          <w:p>
+            <w:pPr>
+              <w:keepNext/>
+              <w:jc w:val="center"/>
+            </w:pPr>
+            <w:r>
+              <w:drawing>
+                <wp:inline xmlns:a="http://schemas.openxmlformats.org/drawingml/2006/main" xmlns:pic="http://schemas.openxmlformats.org/drawingml/2006/picture">
+                  <wp:extent cx="1260000" cy="1260000"/>
+                  <wp:docPr id="1744882281" name="Picture 1744882281"/>
+                  <wp:cNvGraphicFramePr>
+                    <a:graphicFrameLocks noChangeAspect="1"/>
+                  </wp:cNvGraphicFramePr>
+                  <a:graphic>
+                    <a:graphicData uri="http://schemas.openxmlformats.org/drawingml/2006/picture">
+                      <pic:pic>
+                        <pic:nvPicPr>
+                          <pic:cNvPr id="0" name="image.png"/>
+                          <pic:cNvPicPr/>
+                        </pic:nvPicPr>
+                        <pic:blipFill>
+                          <a:blip r:embed="rId22"/>
+                          <a:stretch>
+                            <a:fillRect/>
+                          </a:stretch>
+                        </pic:blipFill>
+                        <pic:spPr>
+                          <a:xfrm>
+                            <a:off x="0" y="0"/>
+                            <a:ext cx="1260000" cy="1260000"/>
+                          </a:xfrm>
+                          <a:prstGeom prst="rect"/>
+                        </pic:spPr>
+                      </pic:pic>
+                    </a:graphicData>
+                  </a:graphic>
+                </wp:inline>
+              </w:drawing>
+            </w:r>
+          </w:p>
+          <w:p>
+            <w:pPr>
+              <w:jc w:val="center"/>
+            </w:pPr>
+            <w:hyperlink r:id="rId23">
+              <w:r>
+                <w:rPr>
+                  <w:sz w:val="17"/>
+                </w:rPr>
+                <w:t xml:space="preserve">https://gilgapy.github.io/sig-informalidad-villarrica/</w:t>
+              </w:r>
+            </w:hyperlink>
+          </w:p>
+        </w:tc>
+        <w:tc>
+          <w:tcPr>
+            <w:tcW w:w="4513" w:type="dxa"/>
+          </w:tcPr>
+          <w:p>
+            <w:pPr>
+              <w:keepNext/>
+              <w:jc w:val="center"/>
+            </w:pPr>
+            <w:r>
+              <w:rPr>
+                <w:b/>
+              </w:rPr>
+              <w:t xml:space="preserve">Código fuente y datos</w:t>
+            </w:r>
+          </w:p>
+          <w:p>
+            <w:pPr>
+              <w:keepNext/>
+              <w:jc w:val="center"/>
+            </w:pPr>
+            <w:r>
+              <w:drawing>
+                <wp:inline xmlns:a="http://schemas.openxmlformats.org/drawingml/2006/main" xmlns:pic="http://schemas.openxmlformats.org/drawingml/2006/picture">
+                  <wp:extent cx="1260000" cy="1260000"/>
+                  <wp:docPr id="1744882281" name="Picture 1744882281"/>
+                  <wp:cNvGraphicFramePr>
+                    <a:graphicFrameLocks noChangeAspect="1"/>
+                  </wp:cNvGraphicFramePr>
+                  <a:graphic>
+                    <a:graphicData uri="http://schemas.openxmlformats.org/drawingml/2006/picture">
+                      <pic:pic>
+                        <pic:nvPicPr>
+                          <pic:cNvPr id="0" name="image.png"/>
+                          <pic:cNvPicPr/>
+                        </pic:nvPicPr>
+                        <pic:blipFill>
+                          <a:blip r:embed="rId28"/>
+                          <a:stretch>
+                            <a:fillRect/>
+                          </a:stretch>
+                        </pic:blipFill>
+                        <pic:spPr>
+                          <a:xfrm>
+                            <a:off x="0" y="0"/>
+                            <a:ext cx="1260000" cy="1260000"/>
+                          </a:xfrm>
+                          <a:prstGeom prst="rect"/>
+                        </pic:spPr>
+                      </pic:pic>
+                    </a:graphicData>
+                  </a:graphic>
+                </wp:inline>
+              </w:drawing>
+            </w:r>
+          </w:p>
+          <w:p>
+            <w:pPr>
+              <w:jc w:val="center"/>
+            </w:pPr>
+            <w:hyperlink r:id="rId29">
+              <w:r>
+                <w:rPr>
+                  <w:sz w:val="17"/>
+                </w:rPr>
+                <w:t xml:space="preserve">https://github.com/gilgapy/sig-informalidad-villarrica</w:t>
+              </w:r>
+            </w:hyperlink>
+          </w:p>
+        </w:tc>
+      </w:tr>
+    </w:tbl>
     <w:p>
       <w:pPr>
         <w:pStyle w:val="FirstParagraph"/>
@@ -13825,117 +13943,6 @@
       <w:r>
         <w:t xml:space="preserve"> Pieza impresa en formato A4 para la campaña de marketing social descrita en el Capítulo III. Presenta los tres trámites de formalización (RESIMPLE, IPS y SUACE), dos cifras del relevamiento UNVES 2026 (95 de cada 100 trabajadores informales sin seguro del IPS; 51 % de las microempresas sin RUC) y un código QR de contacto por WhatsApp. Elaboración propia.</w:t>
       </w:r>
-    </w:p>
-    <w:p>
-      <w:pPr>
-        <w:pStyle w:val="FirstParagraph"/>
-        <w:pageBreakBefore/>
-        <w:keepNext/>
-      </w:pPr>
-      <w:r>
-        <w:rPr>
-          <w:b/>
-          <w:bCs/>
-        </w:rPr>
-        <w:t xml:space="preserve">Anexo C.</w:t>
-      </w:r>
-      <w:r>
-        <w:t xml:space="preserve"> Código fuente y datos para replicar el estudio</w:t>
-      </w:r>
-    </w:p>
-    <w:p>
-      <w:pPr>
-        <w:pStyle w:val="Textoindependiente"/>
-      </w:pPr>
-      <w:r>
-        <w:t xml:space="preserve">El repositorio público del proyecto en GitHub reúne todo lo necesario para reproducir el análisis: los conjuntos de datos crudos y procesados (</w:t>
-      </w:r>
-      <w:r>
-        <w:rPr>
-          <w:rStyle w:val="VerbatimChar"/>
-          <w:sz w:val="20"/>
-        </w:rPr>
-        <w:t xml:space="preserve">data/</w:t>
-      </w:r>
-      <w:r>
-        <w:t xml:space="preserve">) con su diccionario de datos, el formulario XLSForm de KoboToolbox, el esquema de la base de datos PostgreSQL y el pipeline ETL en Python, el script de análisis estadístico en R, el dashboard gerencial y este informe. El archivo </w:t>
-      </w:r>
-      <w:r>
-        <w:rPr>
-          <w:rStyle w:val="VerbatimChar"/>
-          <w:sz w:val="20"/>
-        </w:rPr>
-        <w:t xml:space="preserve">README.md</w:t>
-      </w:r>
-      <w:r>
-        <w:t xml:space="preserve"> describe los requisitos y el orden de ejecución.</w:t>
-      </w:r>
-    </w:p>
-    <w:p>
-      <w:pPr>
-        <w:pStyle w:val="Textoindependiente"/>
-        <w:keepNext/>
-      </w:pPr>
-      <w:r>
-        <w:rPr>
-          <w:b/>
-        </w:rPr>
-        <w:t xml:space="preserve">Acceso en línea. </w:t>
-      </w:r>
-      <w:r>
-        <w:t xml:space="preserve">Escanee el siguiente código QR para abrir el repositorio:</w:t>
-      </w:r>
-    </w:p>
-    <w:p>
-      <w:pPr>
-        <w:pStyle w:val="Textoindependiente"/>
-        <w:keepNext/>
-        <w:jc w:val="center"/>
-      </w:pPr>
-      <w:r>
-        <w:drawing>
-          <wp:inline xmlns:a="http://schemas.openxmlformats.org/drawingml/2006/main" xmlns:pic="http://schemas.openxmlformats.org/drawingml/2006/picture">
-            <wp:extent cx="1260000" cy="1260000"/>
-            <wp:docPr id="1744882280" name="Picture 1744882280"/>
-            <wp:cNvGraphicFramePr>
-              <a:graphicFrameLocks noChangeAspect="1"/>
-            </wp:cNvGraphicFramePr>
-            <a:graphic>
-              <a:graphicData uri="http://schemas.openxmlformats.org/drawingml/2006/picture">
-                <pic:pic>
-                  <pic:nvPicPr>
-                    <pic:cNvPr id="0" name="qr_github_repositorio.png"/>
-                    <pic:cNvPicPr/>
-                  </pic:nvPicPr>
-                  <pic:blipFill>
-                    <a:blip r:embed="rId28"/>
-                    <a:stretch>
-                      <a:fillRect/>
-                    </a:stretch>
-                  </pic:blipFill>
-                  <pic:spPr>
-                    <a:xfrm>
-                      <a:off x="0" y="0"/>
-                      <a:ext cx="1260000" cy="1260000"/>
-                    </a:xfrm>
-                    <a:prstGeom prst="rect"/>
-                  </pic:spPr>
-                </pic:pic>
-              </a:graphicData>
-            </a:graphic>
-          </wp:inline>
-        </w:drawing>
-      </w:r>
-    </w:p>
-    <w:p>
-      <w:pPr>
-        <w:jc w:val="center"/>
-      </w:pPr>
-      <w:hyperlink r:id="rId29">
-        <w:r>
-          <w:t xml:space="preserve">https://github.com/gilgapy/sig-informalidad-villarrica</w:t>
-        </w:r>
-      </w:hyperlink>
     </w:p>
     <w:sectPr>
       <w:headerReference w:type="default" r:id="rId24"/>

</xml_diff>